<commit_message>
Update pricing to 25k/39k/59k/99k, early client offers, Vera in demo-chat & CRM, and docx offer
</commit_message>
<xml_diff>
--- a/документы/1. Публичная оферта Altai Optima.docx
+++ b/документы/1. Публичная оферта Altai Optima.docx
@@ -783,6 +783,14 @@
       </w:pPr>
       <w:r>
         <w:t xml:space="preserve">6.5. Исполнитель вправе в одностороннем порядке пересматривать стоимость Тарифов на будущие периоды, уведомив об этом Заказчика на Сайте либо через мессенджер не менее чем за 14 (четырнадцать) календарных дней. Для оплаченных периодов стоимость изменению не подлежит.</w:t>
+      </w:r>
+    </w:p>
+    <w:p>
+      <w:pPr>
+        <w:pStyle w:val="BodyText"/>
+      </w:pPr>
+      <w:r>
+        <w:t xml:space="preserve">6.6. При возникновении обязанности по уплате НДС стоимость может быть увеличена на сумму налога с уведомлением клиента.</w:t>
       </w:r>
     </w:p>
     <w:p>

</xml_diff>